<commit_message>
Remove em dashes from Hinweis submission
Co-Authored-By: Claude Sonnet 5.5 <noreply@anthropic.com>
</commit_message>
<xml_diff>
--- a/paper/hinweis/Final Submission.docx
+++ b/paper/hinweis/Final Submission.docx
@@ -119,7 +119,7 @@
         <w:rPr>
           <w:szCs w:val="18"/>
         </w:rPr>
-        <w:t>—Silicon sampling asks a language model to answer a survey as if it were a respondent with a given demographic profile, which would be far cheaper than fielding a questionnaire. We ask what the profile actually contributes and what fine-tuning changes, using Pew Research Center's Religion in India survey (N = 29,999) and the World Values Survey wave 7 (WVS-7) for India (N = 1,692), with every method scored on the same respondent-item rows as matched classifiers. On a 200-respondent Pew subset, zero-shot Qwen2.5-7B-Instruct gets 17.5% right, against 30.2% for always giving the most common answer. It reacts strongly to the profile (the profile explains 29% of its prediction variance, against 4% for real answers), but its group differences correlate only r = 0.22 with the real ones, and removing the profile raises accuracy by 3.6 points. After fine-tuning with QLoRA (quantised low-rank adaptation) on 184,853 respondent-level examples, the model reaches 38.0% on all 6,000 held-out respondents (majority 30.4%, logistic regression 38.5%, gradient boosting 40.0%) and is well calibrated (expected calibration error 0.009). The gain did not carry over to new questions in our test: an approximate port of the adapter scores 28.9% on eight unseen items against 28.5% for its base model. The in-domain gain is 13.7 points larger over respondents, but with eight items per side that difference cannot be told apart from zero. A 120B zero-shot model scores 27.6% on 100 respondents, below the 30.0% majority class (not significant). Logistic regression needs about 400 labelled respondents, and gradient boosting about 1,600, to clear the majority class. On WVS-7 India, three zero-shot large language models (LLMs) score 22 to 26% on 15 items where the majority class scores 21 to 25%, and their group differences carry no directional signal.</w:t>
+        <w:t>: Silicon sampling asks a language model to answer a survey as if it were a respondent with a given demographic profile, which would be far cheaper than fielding a questionnaire. We ask what the profile actually contributes and what fine-tuning changes, using Pew Research Center's Religion in India survey (N = 29,999) and the World Values Survey wave 7 (WVS-7) for India (N = 1,692), with every method scored on the same respondent-item rows as matched classifiers. On a 200-respondent Pew subset, zero-shot Qwen2.5-7B-Instruct gets 17.5% right, against 30.2% for always giving the most common answer. It reacts strongly to the profile (the profile explains 29% of its prediction variance, against 4% for real answers), but its group differences correlate only r = 0.22 with the real ones, and removing the profile raises accuracy by 3.6 points. After fine-tuning with QLoRA (quantised low-rank adaptation) on 184,853 respondent-level examples, the model reaches 38.0% on all 6,000 held-out respondents (majority 30.4%, logistic regression 38.5%, gradient boosting 40.0%) and is well calibrated (expected calibration error 0.009). The gain did not carry over to new questions in our test: an approximate port of the adapter scores 28.9% on eight unseen items against 28.5% for its base model. The in-domain gain is 13.7 points larger over respondents, but with eight items per side that difference cannot be told apart from zero. A 120B zero-shot model scores 27.6% on 100 respondents, below the 30.0% majority class (not significant). Logistic regression needs about 400 labelled respondents, and gradient boosting about 1,600, to clear the majority class. On WVS-7 India, three zero-shot large language models (LLMs) score 22 to 26% on 15 items where the majority class scores 21 to 25%, and their group differences carry no directional signal.</w:t>
       </w:r>
     </w:p>
     <w:p>
@@ -155,7 +155,7 @@
           <w:sz w:val="18"/>
           <w:szCs w:val="18"/>
         </w:rPr>
-        <w:t>—silicon sampling, survey simulation, large language models, QLoRA fine-tuning, calibration, demographic conditioning, Pew Research Center, World Values Survey</w:t>
+        <w:t>: silicon sampling, survey simulation, large language models, QLoRA fine-tuning, calibration, demographic conditioning, Pew Research Center, World Values Survey</w:t>
       </w:r>
     </w:p>
     <w:p>

</xml_diff>